<commit_message>
Lista de Práticas: Lucas 10:36-37 na introdução; fecho com Lucas 17:10, Efésios 2:10 e Romanos 4:5
Co-Authored-By: Claude Fable 5.1 <noreply@anthropic.com>
</commit_message>
<xml_diff>
--- a/pesquisa-2-deveres-sociais/docs/02-lista-de-praticas/Lista_de_Praticas_do_Voluntario.docx
+++ b/pesquisa-2-deveres-sociais/docs/02-lista-de-praticas/Lista_de_Praticas_do_Voluntario.docx
@@ -87,6 +87,32 @@
           <w:sz w:val="22"/>
         </w:rPr>
         <w:t>COMO USAR ESTA LISTA</w:t>
+      </w:r>
+    </w:p>
+    <w:p>
+      <w:pPr>
+        <w:spacing w:before="0" w:after="80" w:line="240" w:lineRule="auto"/>
+        <w:jc w:val="both"/>
+      </w:pPr>
+      <w:r>
+        <w:rPr>
+          <w:rFonts w:ascii="Calibri" w:hAnsi="Calibri" w:eastAsia="Calibri"/>
+          <w:b w:val="0"/>
+          <w:i/>
+          <w:color w:val="2D5130"/>
+          <w:sz w:val="20"/>
+        </w:rPr>
+        <w:t xml:space="preserve">“Qual destes três lhe parece ter sido o próximo do homem que caiu nas mãos dos assaltantes? Ele respondeu: — O que usou de misericórdia para com ele. Então Jesus lhe disse: — Vá e faça o mesmo.”  </w:t>
+      </w:r>
+      <w:r>
+        <w:rPr>
+          <w:rFonts w:ascii="Calibri" w:hAnsi="Calibri" w:eastAsia="Calibri"/>
+          <w:b/>
+          <w:i w:val="0"/>
+          <w:color w:val="2D5130"/>
+          <w:sz w:val="19"/>
+        </w:rPr>
+        <w:t>(Lucas 10:36-37)</w:t>
       </w:r>
     </w:p>
     <w:p>
@@ -8543,11 +8569,6 @@
       <w:pPr>
         <w:spacing w:after="40"/>
       </w:pPr>
-    </w:p>
-    <w:p>
-      <w:r>
-        <w:br w:type="page"/>
-      </w:r>
     </w:p>
     <w:p>
       <w:pPr>
@@ -8835,6 +8856,128 @@
           <w:sz w:val="18"/>
         </w:rPr>
         <w:t>Resumo do mês — práticas realizadas: ______ de 52      Assinatura do voluntário: ______________________________</w:t>
+      </w:r>
+    </w:p>
+    <w:p>
+      <w:pPr>
+        <w:keepNext/>
+        <w:spacing w:before="160" w:after="60" w:line="240" w:lineRule="auto"/>
+        <w:pBdr>
+          <w:bottom w:val="single" w:sz="12" w:space="1" w:color="2D5130"/>
+        </w:pBdr>
+      </w:pPr>
+      <w:r>
+        <w:rPr>
+          <w:rFonts w:ascii="Calibri" w:hAnsi="Calibri" w:eastAsia="Calibri"/>
+          <w:b/>
+          <w:i w:val="0"/>
+          <w:color w:val="2D5130"/>
+          <w:sz w:val="22"/>
+        </w:rPr>
+        <w:t xml:space="preserve">  </w:t>
+      </w:r>
+      <w:r>
+        <w:rPr>
+          <w:rFonts w:ascii="Calibri" w:hAnsi="Calibri" w:eastAsia="Calibri"/>
+          <w:b/>
+          <w:i w:val="0"/>
+          <w:color w:val="2D5130"/>
+          <w:sz w:val="22"/>
+        </w:rPr>
+        <w:t>PARA LEMBRAR</w:t>
+      </w:r>
+    </w:p>
+    <w:p>
+      <w:pPr>
+        <w:spacing w:before="0" w:after="80" w:line="240" w:lineRule="auto"/>
+        <w:jc w:val="both"/>
+      </w:pPr>
+      <w:r>
+        <w:rPr>
+          <w:rFonts w:ascii="Calibri" w:hAnsi="Calibri" w:eastAsia="Calibri"/>
+          <w:b w:val="0"/>
+          <w:i/>
+          <w:color w:val="2D5130"/>
+          <w:sz w:val="20"/>
+        </w:rPr>
+        <w:t xml:space="preserve">“Assim também vocês, depois de terem feito tudo o que lhes foi ordenado, digam: ‘Somos servos inúteis, porque fizemos apenas o que devíamos fazer.’”  </w:t>
+      </w:r>
+      <w:r>
+        <w:rPr>
+          <w:rFonts w:ascii="Calibri" w:hAnsi="Calibri" w:eastAsia="Calibri"/>
+          <w:b/>
+          <w:i w:val="0"/>
+          <w:color w:val="2D5130"/>
+          <w:sz w:val="19"/>
+        </w:rPr>
+        <w:t>(Lucas 17:10)</w:t>
+      </w:r>
+    </w:p>
+    <w:p>
+      <w:pPr>
+        <w:spacing w:before="0" w:after="80" w:line="240" w:lineRule="auto"/>
+        <w:jc w:val="both"/>
+      </w:pPr>
+      <w:r>
+        <w:rPr>
+          <w:rFonts w:ascii="Calibri" w:hAnsi="Calibri" w:eastAsia="Calibri"/>
+          <w:b w:val="0"/>
+          <w:i/>
+          <w:color w:val="2D5130"/>
+          <w:sz w:val="20"/>
+        </w:rPr>
+        <w:t xml:space="preserve">“Pois somos feitura dele, criados em Cristo Jesus para boas obras, as quais Deus de antemão preparou para que andássemos nelas.”  </w:t>
+      </w:r>
+      <w:r>
+        <w:rPr>
+          <w:rFonts w:ascii="Calibri" w:hAnsi="Calibri" w:eastAsia="Calibri"/>
+          <w:b/>
+          <w:i w:val="0"/>
+          <w:color w:val="2D5130"/>
+          <w:sz w:val="19"/>
+        </w:rPr>
+        <w:t>(Efésios 2:10)</w:t>
+      </w:r>
+    </w:p>
+    <w:p>
+      <w:pPr>
+        <w:spacing w:before="0" w:after="80" w:line="240" w:lineRule="auto"/>
+        <w:jc w:val="both"/>
+      </w:pPr>
+      <w:r>
+        <w:rPr>
+          <w:rFonts w:ascii="Calibri" w:hAnsi="Calibri" w:eastAsia="Calibri"/>
+          <w:b w:val="0"/>
+          <w:i/>
+          <w:color w:val="2D5130"/>
+          <w:sz w:val="20"/>
+        </w:rPr>
+        <w:t xml:space="preserve">“Mas, para aquele que não trabalha, porém crê naquele que justifica o ímpio, a sua fé lhe é atribuída como justiça.”  </w:t>
+      </w:r>
+      <w:r>
+        <w:rPr>
+          <w:rFonts w:ascii="Calibri" w:hAnsi="Calibri" w:eastAsia="Calibri"/>
+          <w:b/>
+          <w:i w:val="0"/>
+          <w:color w:val="2D5130"/>
+          <w:sz w:val="19"/>
+        </w:rPr>
+        <w:t>(Romanos 4:5)</w:t>
+      </w:r>
+    </w:p>
+    <w:p>
+      <w:pPr>
+        <w:spacing w:before="0" w:after="60" w:line="240" w:lineRule="auto"/>
+      </w:pPr>
+      <w:r>
+        <w:rPr>
+          <w:rFonts w:ascii="Calibri" w:hAnsi="Calibri" w:eastAsia="Calibri"/>
+          <w:b w:val="0"/>
+          <w:i/>
+          <w:color w:val="595959"/>
+          <w:sz w:val="16"/>
+        </w:rPr>
+        <w:t>Textos bíblicos na Nova Almeida Atualizada, transcritos para este estudo; conferir com a edição da SBB antes da impressão definitiva.</w:t>
       </w:r>
     </w:p>
     <w:sectPr>

</xml_diff>